<commit_message>
Harden Gemini retry/timeout, document incomplete safety re-run
- geminiClient.ts: retry now also covers 503 UNAVAILABLE and our own
  timeout (not just 429), timeout raised 20s -> 30s, max retries 3 -> 4 —
  based on observing a legitimate multi-minute successful response during
  a prior high-demand episode.
- safetyTest.ts: per-question try/catch so one persistent failure no
  longer aborts the remaining questions; reports a separate error count
  and refuses to imply "passed" for anything that didn't actually run.

Even with the more tolerant settings, a full re-run against
gemini-3.5-flash-lite still failed 12/12 on 503 (Google-side high-demand
outage during testing, not our bug — logged in Tech Spec bagian 11 as a
mandatory pre-submission follow-up). Existing compliance evidence stands:
the full gemini-2.5-flash run (12/12, manually reviewed) plus two
successful gemini-3.5-flash-lite spot-checks before the outage began.

Co-Authored-By: Claude Sonnet 5 <noreply@anthropic.com>
</commit_message>
<xml_diff>
--- a/docs/Technical Spec Sectors Hackathon.docx
+++ b/docs/Technical Spec Sectors Hackathon.docx
@@ -4338,6 +4338,38 @@
           <w:p>
             <w:r>
               <w:t>gemini-2.5-flash pada API key yang baru dibuat ternyata dibatasi 20 permintaan/HARI (jauh di bawah dokumentasi resmi 500-1500/hari -- kemungkinan kuota ramp-up untuk key baru), ditemukan langsung habis saat uji lanjutan setelah uji keamanan awal. gemini-2.5-flash-lite ternyata sudah dihentikan Google (pesan API mengarahkan ke gemini-3.5-flash-lite). Setelah pindah ke gemini-3.5-flash-lite, permintaan berhasil namun sempat menggantung beberapa menit tanpa error karena SDK @google/genai tidak punya timeout bawaan -- ditambahkan Promise.race 20 detik agar gagal cepat dan dapat di-retry, bukan menggantung permintaan pengguna tanpa batas. TINDAK LANJUT: jalankan ulang npm run test:ai-safety dengan model baru sebelum submission final untuk memastikan kepatuhan tidak berubah akibat model berbeda.</w:t>
+            </w:r>
+          </w:p>
+        </w:tc>
+      </w:tr>
+      <w:tr>
+        <w:tc>
+          <w:tcPr>
+            <w:tcW w:type="dxa" w:w="1500"/>
+          </w:tcPr>
+          <w:p>
+            <w:r>
+              <w:t>4 September 2026</w:t>
+            </w:r>
+          </w:p>
+        </w:tc>
+        <w:tc>
+          <w:tcPr>
+            <w:tcW w:type="dxa" w:w="3800"/>
+          </w:tcPr>
+          <w:p>
+            <w:r>
+              <w:t>Uji ulang npm run test:ai-safety dengan gemini-3.5-flash-lite BELUM tuntas -- 12/12 pertanyaan gagal dipanggil (503 UNAVAILABLE / high demand) meski sudah diperbesar timeout ke 30 detik dan retry ke 4 kali.</w:t>
+            </w:r>
+          </w:p>
+        </w:tc>
+        <w:tc>
+          <w:tcPr>
+            <w:tcW w:type="dxa" w:w="3726"/>
+          </w:tcPr>
+          <w:p>
+            <w:r>
+              <w:t>Google mengalami gangguan/permintaan tinggi meluas untuk model ini saat pengujian (bukan bug di sisi kami -- seluruh 12 pertanyaan gagal dengan error yang identik). Bukti kepatuhan yang tersedia: run penuh sebelumnya dengan gemini-2.5-flash (12/12 lolos, sudah direview manual) dan 2 spot-check dengan gemini-3.5-flash-lite yang berhasil sebelum gangguan dimulai (keduanya juga compliant). System instruction tidak berubah antar model. WAJIB: jalankan ulang npm run test:ai-safety sampai 12/12 berhasil dipanggil (bukan error) sebelum submission final.</w:t>
             </w:r>
           </w:p>
         </w:tc>

</xml_diff>